<commit_message>
Fix Document - 2
</commit_message>
<xml_diff>
--- a/Document.docx
+++ b/Document.docx
@@ -13718,50 +13718,1271 @@
         <w:spacing w:after="0" w:line="240" w:lineRule="auto"/>
         <w:rPr>
           <w:rFonts w:cs="B Nazanin"/>
-          <w:color w:val="000000" w:themeColor="text1"/>
-          <w:sz w:val="28"/>
-          <w:szCs w:val="28"/>
-        </w:rPr>
-      </w:pPr>
-    </w:p>
-    <w:p>
-      <w:pPr>
-        <w:shd w:val="clear" w:color="auto" w:fill="FFFFFF" w:themeFill="background1"/>
-        <w:bidi/>
-        <w:spacing w:after="0" w:line="240" w:lineRule="auto"/>
-        <w:rPr>
-          <w:rFonts w:cs="B Nazanin"/>
-          <w:color w:val="000000" w:themeColor="text1"/>
-          <w:sz w:val="28"/>
-          <w:szCs w:val="28"/>
-          <w:rtl/>
-        </w:rPr>
-      </w:pPr>
-    </w:p>
-    <w:p>
-      <w:pPr>
-        <w:shd w:val="clear" w:color="auto" w:fill="FFFFFF" w:themeFill="background1"/>
-        <w:bidi/>
-        <w:spacing w:after="0" w:line="240" w:lineRule="auto"/>
-        <w:rPr>
-          <w:rFonts w:cs="B Nazanin"/>
-          <w:b/>
-          <w:bCs/>
-          <w:color w:val="000000" w:themeColor="text1"/>
-          <w:sz w:val="28"/>
-          <w:szCs w:val="28"/>
-        </w:rPr>
-      </w:pPr>
-      <w:r>
-        <w:rPr>
-          <w:rFonts w:cs="B Nazanin"/>
-          <w:b/>
-          <w:bCs/>
-          <w:color w:val="000000" w:themeColor="text1"/>
-          <w:sz w:val="28"/>
-          <w:szCs w:val="28"/>
-          <w:rtl/>
-        </w:rPr>
+          <w:b/>
+          <w:bCs/>
+          <w:color w:val="000000" w:themeColor="text1"/>
+          <w:sz w:val="28"/>
+          <w:szCs w:val="28"/>
+          <w:rtl/>
+        </w:rPr>
+      </w:pPr>
+      <w:r>
+        <w:rPr>
+          <w:rFonts w:cs="B Nazanin" w:hint="cs"/>
+          <w:b/>
+          <w:bCs/>
+          <w:color w:val="000000" w:themeColor="text1"/>
+          <w:sz w:val="28"/>
+          <w:szCs w:val="28"/>
+          <w:rtl/>
+        </w:rPr>
+        <w:lastRenderedPageBreak/>
+        <w:t>فرض های غیرصریح</w:t>
+      </w:r>
+    </w:p>
+    <w:p>
+      <w:pPr>
+        <w:shd w:val="clear" w:color="auto" w:fill="FFFFFF" w:themeFill="background1"/>
+        <w:bidi/>
+        <w:spacing w:after="0" w:line="240" w:lineRule="auto"/>
+        <w:rPr>
+          <w:rFonts w:cs="B Nazanin"/>
+          <w:b/>
+          <w:bCs/>
+          <w:color w:val="000000" w:themeColor="text1"/>
+          <w:sz w:val="28"/>
+          <w:szCs w:val="28"/>
+        </w:rPr>
+      </w:pPr>
+      <w:r>
+        <w:rPr>
+          <w:rFonts w:cs="B Nazanin"/>
+          <w:b/>
+          <w:bCs/>
+          <w:color w:val="000000" w:themeColor="text1"/>
+          <w:sz w:val="28"/>
+          <w:szCs w:val="28"/>
+          <w:rtl/>
+        </w:rPr>
+        <w:t>در پیاده‌سازی این پروژه، موارد زیر به عنوان فرض‌های طراحی در نظر گرفته شده‌اند، زیرا در صورت مسئله به‌صورت صریح مشخص نشده بودند</w:t>
+      </w:r>
+      <w:r>
+        <w:rPr>
+          <w:rFonts w:cs="B Nazanin"/>
+          <w:b/>
+          <w:bCs/>
+          <w:color w:val="000000" w:themeColor="text1"/>
+          <w:sz w:val="28"/>
+          <w:szCs w:val="28"/>
+        </w:rPr>
+        <w:t>:</w:t>
+      </w:r>
+    </w:p>
+    <w:p>
+      <w:pPr>
+        <w:numPr>
+          <w:ilvl w:val="0"/>
+          <w:numId w:val="26"/>
+        </w:numPr>
+        <w:shd w:val="clear" w:color="auto" w:fill="FFFFFF" w:themeFill="background1"/>
+        <w:bidi/>
+        <w:spacing w:after="0" w:line="240" w:lineRule="auto"/>
+        <w:rPr>
+          <w:rFonts w:cs="B Nazanin"/>
+          <w:b/>
+          <w:bCs/>
+          <w:color w:val="000000" w:themeColor="text1"/>
+          <w:sz w:val="28"/>
+          <w:szCs w:val="28"/>
+        </w:rPr>
+      </w:pPr>
+      <w:r>
+        <w:rPr>
+          <w:rFonts w:cs="B Nazanin"/>
+          <w:b/>
+          <w:bCs/>
+          <w:color w:val="000000" w:themeColor="text1"/>
+          <w:sz w:val="28"/>
+          <w:szCs w:val="28"/>
+          <w:rtl/>
+        </w:rPr>
+        <w:t>تولید خودکار کد محصول</w:t>
+      </w:r>
+    </w:p>
+    <w:p>
+      <w:pPr>
+        <w:numPr>
+          <w:ilvl w:val="1"/>
+          <w:numId w:val="26"/>
+        </w:numPr>
+        <w:shd w:val="clear" w:color="auto" w:fill="FFFFFF" w:themeFill="background1"/>
+        <w:bidi/>
+        <w:spacing w:after="0" w:line="240" w:lineRule="auto"/>
+        <w:rPr>
+          <w:rFonts w:cs="B Nazanin"/>
+          <w:b/>
+          <w:bCs/>
+          <w:color w:val="000000" w:themeColor="text1"/>
+          <w:sz w:val="28"/>
+          <w:szCs w:val="28"/>
+        </w:rPr>
+      </w:pPr>
+      <w:r>
+        <w:rPr>
+          <w:rFonts w:cs="B Nazanin"/>
+          <w:b/>
+          <w:bCs/>
+          <w:color w:val="000000" w:themeColor="text1"/>
+          <w:sz w:val="28"/>
+          <w:szCs w:val="28"/>
+          <w:rtl/>
+        </w:rPr>
+        <w:t xml:space="preserve">سیستم به‌صورت خودکار یک کد با پیشوند </w:t>
+      </w:r>
+      <w:r>
+        <w:rPr>
+          <w:rFonts w:cs="B Nazanin"/>
+          <w:b/>
+          <w:bCs/>
+          <w:color w:val="000000" w:themeColor="text1"/>
+          <w:sz w:val="28"/>
+          <w:szCs w:val="28"/>
+        </w:rPr>
+        <w:t xml:space="preserve">PRD </w:t>
+      </w:r>
+      <w:r>
+        <w:rPr>
+          <w:rFonts w:cs="B Nazanin"/>
+          <w:b/>
+          <w:bCs/>
+          <w:color w:val="000000" w:themeColor="text1"/>
+          <w:sz w:val="28"/>
+          <w:szCs w:val="28"/>
+          <w:rtl/>
+        </w:rPr>
+        <w:t>تولید می‌کند</w:t>
+      </w:r>
+      <w:r>
+        <w:rPr>
+          <w:rFonts w:cs="B Nazanin"/>
+          <w:b/>
+          <w:bCs/>
+          <w:color w:val="000000" w:themeColor="text1"/>
+          <w:sz w:val="28"/>
+          <w:szCs w:val="28"/>
+        </w:rPr>
+        <w:t>.</w:t>
+      </w:r>
+    </w:p>
+    <w:p>
+      <w:pPr>
+        <w:numPr>
+          <w:ilvl w:val="0"/>
+          <w:numId w:val="26"/>
+        </w:numPr>
+        <w:shd w:val="clear" w:color="auto" w:fill="FFFFFF" w:themeFill="background1"/>
+        <w:bidi/>
+        <w:spacing w:after="0" w:line="240" w:lineRule="auto"/>
+        <w:rPr>
+          <w:rFonts w:cs="B Nazanin"/>
+          <w:b/>
+          <w:bCs/>
+          <w:color w:val="000000" w:themeColor="text1"/>
+          <w:sz w:val="28"/>
+          <w:szCs w:val="28"/>
+        </w:rPr>
+      </w:pPr>
+      <w:r>
+        <w:rPr>
+          <w:rFonts w:cs="B Nazanin"/>
+          <w:b/>
+          <w:bCs/>
+          <w:color w:val="000000" w:themeColor="text1"/>
+          <w:sz w:val="28"/>
+          <w:szCs w:val="28"/>
+          <w:rtl/>
+        </w:rPr>
+        <w:t>مرتب‌سازی پیش‌فرض محصولات</w:t>
+      </w:r>
+    </w:p>
+    <w:p>
+      <w:pPr>
+        <w:numPr>
+          <w:ilvl w:val="1"/>
+          <w:numId w:val="26"/>
+        </w:numPr>
+        <w:shd w:val="clear" w:color="auto" w:fill="FFFFFF" w:themeFill="background1"/>
+        <w:bidi/>
+        <w:spacing w:after="0" w:line="240" w:lineRule="auto"/>
+        <w:rPr>
+          <w:rFonts w:cs="B Nazanin"/>
+          <w:b/>
+          <w:bCs/>
+          <w:color w:val="000000" w:themeColor="text1"/>
+          <w:sz w:val="28"/>
+          <w:szCs w:val="28"/>
+        </w:rPr>
+      </w:pPr>
+      <w:r>
+        <w:rPr>
+          <w:rFonts w:cs="B Nazanin"/>
+          <w:b/>
+          <w:bCs/>
+          <w:color w:val="000000" w:themeColor="text1"/>
+          <w:sz w:val="28"/>
+          <w:szCs w:val="28"/>
+          <w:rtl/>
+        </w:rPr>
+        <w:t>لیست محصولات به‌صورت پیش‌فرض بر اساس زمان ایجاد</w:t>
+      </w:r>
+      <w:r>
+        <w:rPr>
+          <w:rFonts w:cs="B Nazanin"/>
+          <w:b/>
+          <w:bCs/>
+          <w:color w:val="000000" w:themeColor="text1"/>
+          <w:sz w:val="28"/>
+          <w:szCs w:val="28"/>
+        </w:rPr>
+        <w:t xml:space="preserve"> (</w:t>
+      </w:r>
+      <w:proofErr w:type="spellStart"/>
+      <w:r>
+        <w:rPr>
+          <w:rFonts w:cs="B Nazanin"/>
+          <w:b/>
+          <w:bCs/>
+          <w:color w:val="000000" w:themeColor="text1"/>
+          <w:sz w:val="28"/>
+          <w:szCs w:val="28"/>
+        </w:rPr>
+        <w:t>CreatedDateTime</w:t>
+      </w:r>
+      <w:proofErr w:type="spellEnd"/>
+      <w:r>
+        <w:rPr>
+          <w:rFonts w:cs="B Nazanin"/>
+          <w:b/>
+          <w:bCs/>
+          <w:color w:val="000000" w:themeColor="text1"/>
+          <w:sz w:val="28"/>
+          <w:szCs w:val="28"/>
+        </w:rPr>
+        <w:t xml:space="preserve">) </w:t>
+      </w:r>
+      <w:r>
+        <w:rPr>
+          <w:rFonts w:cs="B Nazanin"/>
+          <w:b/>
+          <w:bCs/>
+          <w:color w:val="000000" w:themeColor="text1"/>
+          <w:sz w:val="28"/>
+          <w:szCs w:val="28"/>
+          <w:rtl/>
+        </w:rPr>
+        <w:t>و به ترتیب نزولی (جدیدترین به قدیمی‌ترین) مرتب می‌شود</w:t>
+      </w:r>
+      <w:r>
+        <w:rPr>
+          <w:rFonts w:cs="B Nazanin"/>
+          <w:b/>
+          <w:bCs/>
+          <w:color w:val="000000" w:themeColor="text1"/>
+          <w:sz w:val="28"/>
+          <w:szCs w:val="28"/>
+        </w:rPr>
+        <w:t>.</w:t>
+      </w:r>
+    </w:p>
+    <w:p>
+      <w:pPr>
+        <w:numPr>
+          <w:ilvl w:val="0"/>
+          <w:numId w:val="26"/>
+        </w:numPr>
+        <w:shd w:val="clear" w:color="auto" w:fill="FFFFFF" w:themeFill="background1"/>
+        <w:bidi/>
+        <w:spacing w:after="0" w:line="240" w:lineRule="auto"/>
+        <w:rPr>
+          <w:rFonts w:cs="B Nazanin"/>
+          <w:b/>
+          <w:bCs/>
+          <w:color w:val="000000" w:themeColor="text1"/>
+          <w:sz w:val="28"/>
+          <w:szCs w:val="28"/>
+        </w:rPr>
+      </w:pPr>
+      <w:r>
+        <w:rPr>
+          <w:rFonts w:cs="B Nazanin"/>
+          <w:b/>
+          <w:bCs/>
+          <w:color w:val="000000" w:themeColor="text1"/>
+          <w:sz w:val="28"/>
+          <w:szCs w:val="28"/>
+          <w:rtl/>
+        </w:rPr>
+        <w:t>مدیریت اطلاعات سیستمی</w:t>
+      </w:r>
+    </w:p>
+    <w:p>
+      <w:pPr>
+        <w:numPr>
+          <w:ilvl w:val="1"/>
+          <w:numId w:val="26"/>
+        </w:numPr>
+        <w:shd w:val="clear" w:color="auto" w:fill="FFFFFF" w:themeFill="background1"/>
+        <w:bidi/>
+        <w:spacing w:after="0" w:line="240" w:lineRule="auto"/>
+        <w:rPr>
+          <w:rFonts w:cs="B Nazanin"/>
+          <w:b/>
+          <w:bCs/>
+          <w:color w:val="000000" w:themeColor="text1"/>
+          <w:sz w:val="28"/>
+          <w:szCs w:val="28"/>
+        </w:rPr>
+      </w:pPr>
+      <w:r>
+        <w:rPr>
+          <w:rFonts w:cs="B Nazanin"/>
+          <w:b/>
+          <w:bCs/>
+          <w:color w:val="000000" w:themeColor="text1"/>
+          <w:sz w:val="28"/>
+          <w:szCs w:val="28"/>
+          <w:rtl/>
+        </w:rPr>
+        <w:t xml:space="preserve">اطلاعاتی مانند </w:t>
+      </w:r>
+      <w:proofErr w:type="spellStart"/>
+      <w:r>
+        <w:rPr>
+          <w:rFonts w:cs="B Nazanin"/>
+          <w:b/>
+          <w:bCs/>
+          <w:color w:val="000000" w:themeColor="text1"/>
+          <w:sz w:val="28"/>
+          <w:szCs w:val="28"/>
+        </w:rPr>
+        <w:t>CreatedDateTime</w:t>
+      </w:r>
+      <w:proofErr w:type="spellEnd"/>
+      <w:r>
+        <w:rPr>
+          <w:rFonts w:cs="B Nazanin"/>
+          <w:b/>
+          <w:bCs/>
+          <w:color w:val="000000" w:themeColor="text1"/>
+          <w:sz w:val="28"/>
+          <w:szCs w:val="28"/>
+        </w:rPr>
+        <w:t xml:space="preserve"> </w:t>
+      </w:r>
+      <w:r>
+        <w:rPr>
+          <w:rFonts w:cs="B Nazanin"/>
+          <w:b/>
+          <w:bCs/>
+          <w:color w:val="000000" w:themeColor="text1"/>
+          <w:sz w:val="28"/>
+          <w:szCs w:val="28"/>
+          <w:rtl/>
+        </w:rPr>
+        <w:t xml:space="preserve">و </w:t>
+      </w:r>
+      <w:proofErr w:type="spellStart"/>
+      <w:r>
+        <w:rPr>
+          <w:rFonts w:cs="B Nazanin"/>
+          <w:b/>
+          <w:bCs/>
+          <w:color w:val="000000" w:themeColor="text1"/>
+          <w:sz w:val="28"/>
+          <w:szCs w:val="28"/>
+        </w:rPr>
+        <w:t>IsDeleted</w:t>
+      </w:r>
+      <w:proofErr w:type="spellEnd"/>
+      <w:r>
+        <w:rPr>
+          <w:rFonts w:cs="B Nazanin"/>
+          <w:b/>
+          <w:bCs/>
+          <w:color w:val="000000" w:themeColor="text1"/>
+          <w:sz w:val="28"/>
+          <w:szCs w:val="28"/>
+        </w:rPr>
+        <w:t xml:space="preserve"> </w:t>
+      </w:r>
+      <w:r>
+        <w:rPr>
+          <w:rFonts w:cs="B Nazanin"/>
+          <w:b/>
+          <w:bCs/>
+          <w:color w:val="000000" w:themeColor="text1"/>
+          <w:sz w:val="28"/>
+          <w:szCs w:val="28"/>
+          <w:rtl/>
+        </w:rPr>
+        <w:t xml:space="preserve">به‌صورت </w:t>
+      </w:r>
+      <w:r>
+        <w:rPr>
+          <w:rFonts w:cs="B Nazanin"/>
+          <w:b/>
+          <w:bCs/>
+          <w:color w:val="000000" w:themeColor="text1"/>
+          <w:sz w:val="28"/>
+          <w:szCs w:val="28"/>
+        </w:rPr>
+        <w:t xml:space="preserve">Shadow Property </w:t>
+      </w:r>
+      <w:r>
+        <w:rPr>
+          <w:rFonts w:cs="B Nazanin"/>
+          <w:b/>
+          <w:bCs/>
+          <w:color w:val="000000" w:themeColor="text1"/>
+          <w:sz w:val="28"/>
+          <w:szCs w:val="28"/>
+          <w:rtl/>
+        </w:rPr>
+        <w:t>توسط</w:t>
+      </w:r>
+      <w:r>
+        <w:rPr>
+          <w:rFonts w:cs="B Nazanin"/>
+          <w:b/>
+          <w:bCs/>
+          <w:color w:val="000000" w:themeColor="text1"/>
+          <w:sz w:val="28"/>
+          <w:szCs w:val="28"/>
+        </w:rPr>
+        <w:t xml:space="preserve"> Entity Framework Core </w:t>
+      </w:r>
+      <w:r>
+        <w:rPr>
+          <w:rFonts w:cs="B Nazanin"/>
+          <w:b/>
+          <w:bCs/>
+          <w:color w:val="000000" w:themeColor="text1"/>
+          <w:sz w:val="28"/>
+          <w:szCs w:val="28"/>
+          <w:rtl/>
+        </w:rPr>
+        <w:t>مدیریت می‌شوند و مستقیماً در کلاس‌های</w:t>
+      </w:r>
+      <w:r>
+        <w:rPr>
+          <w:rFonts w:cs="B Nazanin"/>
+          <w:b/>
+          <w:bCs/>
+          <w:color w:val="000000" w:themeColor="text1"/>
+          <w:sz w:val="28"/>
+          <w:szCs w:val="28"/>
+        </w:rPr>
+        <w:t xml:space="preserve"> Entity </w:t>
+      </w:r>
+      <w:r>
+        <w:rPr>
+          <w:rFonts w:cs="B Nazanin"/>
+          <w:b/>
+          <w:bCs/>
+          <w:color w:val="000000" w:themeColor="text1"/>
+          <w:sz w:val="28"/>
+          <w:szCs w:val="28"/>
+          <w:rtl/>
+        </w:rPr>
+        <w:t>تعریف نشده‌اند</w:t>
+      </w:r>
+      <w:r>
+        <w:rPr>
+          <w:rFonts w:cs="B Nazanin"/>
+          <w:b/>
+          <w:bCs/>
+          <w:color w:val="000000" w:themeColor="text1"/>
+          <w:sz w:val="28"/>
+          <w:szCs w:val="28"/>
+        </w:rPr>
+        <w:t>.</w:t>
+      </w:r>
+    </w:p>
+    <w:p>
+      <w:pPr>
+        <w:numPr>
+          <w:ilvl w:val="0"/>
+          <w:numId w:val="26"/>
+        </w:numPr>
+        <w:shd w:val="clear" w:color="auto" w:fill="FFFFFF" w:themeFill="background1"/>
+        <w:bidi/>
+        <w:spacing w:after="0" w:line="240" w:lineRule="auto"/>
+        <w:rPr>
+          <w:rFonts w:cs="B Nazanin"/>
+          <w:b/>
+          <w:bCs/>
+          <w:color w:val="000000" w:themeColor="text1"/>
+          <w:sz w:val="28"/>
+          <w:szCs w:val="28"/>
+        </w:rPr>
+      </w:pPr>
+      <w:r>
+        <w:rPr>
+          <w:rFonts w:cs="B Nazanin"/>
+          <w:b/>
+          <w:bCs/>
+          <w:color w:val="000000" w:themeColor="text1"/>
+          <w:sz w:val="28"/>
+          <w:szCs w:val="28"/>
+          <w:rtl/>
+        </w:rPr>
+        <w:t>وضعیت فعال بودن محصول</w:t>
+      </w:r>
+    </w:p>
+    <w:p>
+      <w:pPr>
+        <w:numPr>
+          <w:ilvl w:val="1"/>
+          <w:numId w:val="26"/>
+        </w:numPr>
+        <w:shd w:val="clear" w:color="auto" w:fill="FFFFFF" w:themeFill="background1"/>
+        <w:bidi/>
+        <w:spacing w:after="0" w:line="240" w:lineRule="auto"/>
+        <w:rPr>
+          <w:rFonts w:cs="B Nazanin"/>
+          <w:b/>
+          <w:bCs/>
+          <w:color w:val="000000" w:themeColor="text1"/>
+          <w:sz w:val="28"/>
+          <w:szCs w:val="28"/>
+        </w:rPr>
+      </w:pPr>
+      <w:r>
+        <w:rPr>
+          <w:rFonts w:cs="B Nazanin"/>
+          <w:b/>
+          <w:bCs/>
+          <w:color w:val="000000" w:themeColor="text1"/>
+          <w:sz w:val="28"/>
+          <w:szCs w:val="28"/>
+          <w:rtl/>
+        </w:rPr>
+        <w:t>هر محصول دارای وضعیت فعال/غیرفعال</w:t>
+      </w:r>
+      <w:r>
+        <w:rPr>
+          <w:rFonts w:cs="B Nazanin"/>
+          <w:b/>
+          <w:bCs/>
+          <w:color w:val="000000" w:themeColor="text1"/>
+          <w:sz w:val="28"/>
+          <w:szCs w:val="28"/>
+        </w:rPr>
+        <w:t xml:space="preserve"> (</w:t>
+      </w:r>
+      <w:proofErr w:type="spellStart"/>
+      <w:r>
+        <w:rPr>
+          <w:rFonts w:cs="B Nazanin"/>
+          <w:b/>
+          <w:bCs/>
+          <w:color w:val="000000" w:themeColor="text1"/>
+          <w:sz w:val="28"/>
+          <w:szCs w:val="28"/>
+        </w:rPr>
+        <w:t>IsActive</w:t>
+      </w:r>
+      <w:proofErr w:type="spellEnd"/>
+      <w:r>
+        <w:rPr>
+          <w:rFonts w:cs="B Nazanin"/>
+          <w:b/>
+          <w:bCs/>
+          <w:color w:val="000000" w:themeColor="text1"/>
+          <w:sz w:val="28"/>
+          <w:szCs w:val="28"/>
+        </w:rPr>
+        <w:t xml:space="preserve">) </w:t>
+      </w:r>
+      <w:r>
+        <w:rPr>
+          <w:rFonts w:cs="B Nazanin"/>
+          <w:b/>
+          <w:bCs/>
+          <w:color w:val="000000" w:themeColor="text1"/>
+          <w:sz w:val="28"/>
+          <w:szCs w:val="28"/>
+          <w:rtl/>
+        </w:rPr>
+        <w:t>است و این وضعیت در عملیات  ویرایش قابل مدیریت است</w:t>
+      </w:r>
+      <w:r>
+        <w:rPr>
+          <w:rFonts w:cs="B Nazanin"/>
+          <w:b/>
+          <w:bCs/>
+          <w:color w:val="000000" w:themeColor="text1"/>
+          <w:sz w:val="28"/>
+          <w:szCs w:val="28"/>
+        </w:rPr>
+        <w:t>.</w:t>
+      </w:r>
+    </w:p>
+    <w:p>
+      <w:pPr>
+        <w:numPr>
+          <w:ilvl w:val="0"/>
+          <w:numId w:val="26"/>
+        </w:numPr>
+        <w:shd w:val="clear" w:color="auto" w:fill="FFFFFF" w:themeFill="background1"/>
+        <w:bidi/>
+        <w:spacing w:after="0" w:line="240" w:lineRule="auto"/>
+        <w:rPr>
+          <w:rFonts w:cs="B Nazanin"/>
+          <w:b/>
+          <w:bCs/>
+          <w:color w:val="000000" w:themeColor="text1"/>
+          <w:sz w:val="28"/>
+          <w:szCs w:val="28"/>
+        </w:rPr>
+      </w:pPr>
+      <w:r>
+        <w:rPr>
+          <w:rFonts w:cs="B Nazanin"/>
+          <w:b/>
+          <w:bCs/>
+          <w:color w:val="000000" w:themeColor="text1"/>
+          <w:sz w:val="28"/>
+          <w:szCs w:val="28"/>
+          <w:rtl/>
+        </w:rPr>
+        <w:t>عدم وجود محصول</w:t>
+      </w:r>
+    </w:p>
+    <w:p>
+      <w:pPr>
+        <w:numPr>
+          <w:ilvl w:val="1"/>
+          <w:numId w:val="26"/>
+        </w:numPr>
+        <w:shd w:val="clear" w:color="auto" w:fill="FFFFFF" w:themeFill="background1"/>
+        <w:bidi/>
+        <w:spacing w:after="0" w:line="240" w:lineRule="auto"/>
+        <w:rPr>
+          <w:rFonts w:cs="B Nazanin"/>
+          <w:b/>
+          <w:bCs/>
+          <w:color w:val="000000" w:themeColor="text1"/>
+          <w:sz w:val="28"/>
+          <w:szCs w:val="28"/>
+        </w:rPr>
+      </w:pPr>
+      <w:r>
+        <w:rPr>
+          <w:rFonts w:cs="B Nazanin"/>
+          <w:b/>
+          <w:bCs/>
+          <w:color w:val="000000" w:themeColor="text1"/>
+          <w:sz w:val="28"/>
+          <w:szCs w:val="28"/>
+          <w:rtl/>
+        </w:rPr>
+        <w:t xml:space="preserve">در صورتی که محصولی با شناسه درخواستی وجود نداشته باشد، سرویس با پرتاب </w:t>
+      </w:r>
+      <w:proofErr w:type="spellStart"/>
+      <w:r>
+        <w:rPr>
+          <w:rFonts w:cs="B Nazanin"/>
+          <w:b/>
+          <w:bCs/>
+          <w:color w:val="000000" w:themeColor="text1"/>
+          <w:sz w:val="28"/>
+          <w:szCs w:val="28"/>
+        </w:rPr>
+        <w:t>NotFoundException</w:t>
+      </w:r>
+      <w:proofErr w:type="spellEnd"/>
+      <w:r>
+        <w:rPr>
+          <w:rFonts w:cs="B Nazanin"/>
+          <w:b/>
+          <w:bCs/>
+          <w:color w:val="000000" w:themeColor="text1"/>
+          <w:sz w:val="28"/>
+          <w:szCs w:val="28"/>
+        </w:rPr>
+        <w:t xml:space="preserve"> </w:t>
+      </w:r>
+      <w:r>
+        <w:rPr>
+          <w:rFonts w:cs="B Nazanin"/>
+          <w:b/>
+          <w:bCs/>
+          <w:color w:val="000000" w:themeColor="text1"/>
+          <w:sz w:val="28"/>
+          <w:szCs w:val="28"/>
+          <w:rtl/>
+        </w:rPr>
+        <w:t>به این وضعیت پاسخ می‌دهد</w:t>
+      </w:r>
+      <w:r>
+        <w:rPr>
+          <w:rFonts w:cs="B Nazanin"/>
+          <w:b/>
+          <w:bCs/>
+          <w:color w:val="000000" w:themeColor="text1"/>
+          <w:sz w:val="28"/>
+          <w:szCs w:val="28"/>
+        </w:rPr>
+        <w:t>.</w:t>
+      </w:r>
+    </w:p>
+    <w:p>
+      <w:pPr>
+        <w:numPr>
+          <w:ilvl w:val="0"/>
+          <w:numId w:val="26"/>
+        </w:numPr>
+        <w:shd w:val="clear" w:color="auto" w:fill="FFFFFF" w:themeFill="background1"/>
+        <w:bidi/>
+        <w:spacing w:after="0" w:line="240" w:lineRule="auto"/>
+        <w:rPr>
+          <w:rFonts w:cs="B Nazanin"/>
+          <w:b/>
+          <w:bCs/>
+          <w:color w:val="000000" w:themeColor="text1"/>
+          <w:sz w:val="28"/>
+          <w:szCs w:val="28"/>
+        </w:rPr>
+      </w:pPr>
+      <w:r>
+        <w:rPr>
+          <w:rFonts w:cs="B Nazanin"/>
+          <w:b/>
+          <w:bCs/>
+          <w:color w:val="000000" w:themeColor="text1"/>
+          <w:sz w:val="28"/>
+          <w:szCs w:val="28"/>
+          <w:rtl/>
+        </w:rPr>
+        <w:t>واحد اندازه‌گیری</w:t>
+      </w:r>
+    </w:p>
+    <w:p>
+      <w:pPr>
+        <w:numPr>
+          <w:ilvl w:val="1"/>
+          <w:numId w:val="26"/>
+        </w:numPr>
+        <w:shd w:val="clear" w:color="auto" w:fill="FFFFFF" w:themeFill="background1"/>
+        <w:bidi/>
+        <w:spacing w:after="0" w:line="240" w:lineRule="auto"/>
+        <w:rPr>
+          <w:rFonts w:cs="B Nazanin"/>
+          <w:b/>
+          <w:bCs/>
+          <w:color w:val="000000" w:themeColor="text1"/>
+          <w:sz w:val="28"/>
+          <w:szCs w:val="28"/>
+        </w:rPr>
+      </w:pPr>
+      <w:r>
+        <w:rPr>
+          <w:rFonts w:cs="B Nazanin"/>
+          <w:b/>
+          <w:bCs/>
+          <w:color w:val="000000" w:themeColor="text1"/>
+          <w:sz w:val="28"/>
+          <w:szCs w:val="28"/>
+          <w:rtl/>
+        </w:rPr>
+        <w:t>واحد اندازه‌گیری محصولات از مقادیر تعریف‌شده در</w:t>
+      </w:r>
+      <w:r>
+        <w:rPr>
+          <w:rFonts w:cs="B Nazanin"/>
+          <w:b/>
+          <w:bCs/>
+          <w:color w:val="000000" w:themeColor="text1"/>
+          <w:sz w:val="28"/>
+          <w:szCs w:val="28"/>
+        </w:rPr>
+        <w:t xml:space="preserve"> Enum </w:t>
+      </w:r>
+      <w:proofErr w:type="spellStart"/>
+      <w:r>
+        <w:rPr>
+          <w:rFonts w:cs="B Nazanin"/>
+          <w:b/>
+          <w:bCs/>
+          <w:color w:val="000000" w:themeColor="text1"/>
+          <w:sz w:val="28"/>
+          <w:szCs w:val="28"/>
+        </w:rPr>
+        <w:t>UnitOfMeasure</w:t>
+      </w:r>
+      <w:proofErr w:type="spellEnd"/>
+      <w:r>
+        <w:rPr>
+          <w:rFonts w:cs="B Nazanin"/>
+          <w:b/>
+          <w:bCs/>
+          <w:color w:val="000000" w:themeColor="text1"/>
+          <w:sz w:val="28"/>
+          <w:szCs w:val="28"/>
+        </w:rPr>
+        <w:t xml:space="preserve"> </w:t>
+      </w:r>
+      <w:r>
+        <w:rPr>
+          <w:rFonts w:cs="B Nazanin"/>
+          <w:b/>
+          <w:bCs/>
+          <w:color w:val="000000" w:themeColor="text1"/>
+          <w:sz w:val="28"/>
+          <w:szCs w:val="28"/>
+          <w:rtl/>
+        </w:rPr>
+        <w:t>انتخاب می‌شود و مقدار نامعتبر قابل قبول نیست</w:t>
+      </w:r>
+      <w:r>
+        <w:rPr>
+          <w:rFonts w:cs="B Nazanin"/>
+          <w:b/>
+          <w:bCs/>
+          <w:color w:val="000000" w:themeColor="text1"/>
+          <w:sz w:val="28"/>
+          <w:szCs w:val="28"/>
+        </w:rPr>
+        <w:t>.</w:t>
+      </w:r>
+    </w:p>
+    <w:p>
+      <w:pPr>
+        <w:numPr>
+          <w:ilvl w:val="0"/>
+          <w:numId w:val="26"/>
+        </w:numPr>
+        <w:shd w:val="clear" w:color="auto" w:fill="FFFFFF" w:themeFill="background1"/>
+        <w:bidi/>
+        <w:spacing w:after="0" w:line="240" w:lineRule="auto"/>
+        <w:rPr>
+          <w:rFonts w:cs="B Nazanin"/>
+          <w:b/>
+          <w:bCs/>
+          <w:color w:val="000000" w:themeColor="text1"/>
+          <w:sz w:val="28"/>
+          <w:szCs w:val="28"/>
+        </w:rPr>
+      </w:pPr>
+      <w:r>
+        <w:rPr>
+          <w:rFonts w:cs="B Nazanin"/>
+          <w:b/>
+          <w:bCs/>
+          <w:color w:val="000000" w:themeColor="text1"/>
+          <w:sz w:val="28"/>
+          <w:szCs w:val="28"/>
+          <w:rtl/>
+        </w:rPr>
+        <w:t>تست‌ها</w:t>
+      </w:r>
+    </w:p>
+    <w:p>
+      <w:pPr>
+        <w:numPr>
+          <w:ilvl w:val="1"/>
+          <w:numId w:val="26"/>
+        </w:numPr>
+        <w:shd w:val="clear" w:color="auto" w:fill="FFFFFF" w:themeFill="background1"/>
+        <w:bidi/>
+        <w:spacing w:after="0" w:line="240" w:lineRule="auto"/>
+        <w:rPr>
+          <w:rFonts w:cs="B Nazanin"/>
+          <w:b/>
+          <w:bCs/>
+          <w:color w:val="000000" w:themeColor="text1"/>
+          <w:sz w:val="28"/>
+          <w:szCs w:val="28"/>
+        </w:rPr>
+      </w:pPr>
+      <w:r>
+        <w:rPr>
+          <w:rFonts w:cs="B Nazanin"/>
+          <w:b/>
+          <w:bCs/>
+          <w:color w:val="000000" w:themeColor="text1"/>
+          <w:sz w:val="28"/>
+          <w:szCs w:val="28"/>
+          <w:rtl/>
+        </w:rPr>
+        <w:t>برای تست عملیات</w:t>
+      </w:r>
+      <w:r>
+        <w:rPr>
+          <w:rFonts w:cs="B Nazanin"/>
+          <w:b/>
+          <w:bCs/>
+          <w:color w:val="000000" w:themeColor="text1"/>
+          <w:sz w:val="28"/>
+          <w:szCs w:val="28"/>
+        </w:rPr>
+        <w:t xml:space="preserve"> Create</w:t>
+      </w:r>
+      <w:r>
+        <w:rPr>
+          <w:rFonts w:cs="B Nazanin"/>
+          <w:b/>
+          <w:bCs/>
+          <w:color w:val="000000" w:themeColor="text1"/>
+          <w:sz w:val="28"/>
+          <w:szCs w:val="28"/>
+          <w:rtl/>
+        </w:rPr>
+        <w:t xml:space="preserve">، </w:t>
+      </w:r>
+      <w:r>
+        <w:rPr>
+          <w:rFonts w:cs="B Nazanin"/>
+          <w:b/>
+          <w:bCs/>
+          <w:color w:val="000000" w:themeColor="text1"/>
+          <w:sz w:val="28"/>
+          <w:szCs w:val="28"/>
+        </w:rPr>
+        <w:t xml:space="preserve">Update </w:t>
+      </w:r>
+      <w:r>
+        <w:rPr>
+          <w:rFonts w:cs="B Nazanin"/>
+          <w:b/>
+          <w:bCs/>
+          <w:color w:val="000000" w:themeColor="text1"/>
+          <w:sz w:val="28"/>
+          <w:szCs w:val="28"/>
+          <w:rtl/>
+        </w:rPr>
+        <w:t>و</w:t>
+      </w:r>
+      <w:r>
+        <w:rPr>
+          <w:rFonts w:cs="B Nazanin"/>
+          <w:b/>
+          <w:bCs/>
+          <w:color w:val="000000" w:themeColor="text1"/>
+          <w:sz w:val="28"/>
+          <w:szCs w:val="28"/>
+        </w:rPr>
+        <w:t xml:space="preserve"> Delete </w:t>
+      </w:r>
+      <w:r>
+        <w:rPr>
+          <w:rFonts w:cs="B Nazanin"/>
+          <w:b/>
+          <w:bCs/>
+          <w:color w:val="000000" w:themeColor="text1"/>
+          <w:sz w:val="28"/>
+          <w:szCs w:val="28"/>
+          <w:rtl/>
+        </w:rPr>
+        <w:t>از</w:t>
+      </w:r>
+      <w:r>
+        <w:rPr>
+          <w:rFonts w:cs="B Nazanin"/>
+          <w:b/>
+          <w:bCs/>
+          <w:color w:val="000000" w:themeColor="text1"/>
+          <w:sz w:val="28"/>
+          <w:szCs w:val="28"/>
+        </w:rPr>
+        <w:t xml:space="preserve"> Mock Repository </w:t>
+      </w:r>
+      <w:r>
+        <w:rPr>
+          <w:rFonts w:cs="B Nazanin"/>
+          <w:b/>
+          <w:bCs/>
+          <w:color w:val="000000" w:themeColor="text1"/>
+          <w:sz w:val="28"/>
+          <w:szCs w:val="28"/>
+          <w:rtl/>
+        </w:rPr>
+        <w:t>استفاده شده است تا منطق سرویس به‌صورت مستقل بررسی شود</w:t>
+      </w:r>
+      <w:r>
+        <w:rPr>
+          <w:rFonts w:cs="B Nazanin"/>
+          <w:b/>
+          <w:bCs/>
+          <w:color w:val="000000" w:themeColor="text1"/>
+          <w:sz w:val="28"/>
+          <w:szCs w:val="28"/>
+        </w:rPr>
+        <w:t>.</w:t>
+      </w:r>
+    </w:p>
+    <w:p>
+      <w:pPr>
+        <w:numPr>
+          <w:ilvl w:val="1"/>
+          <w:numId w:val="26"/>
+        </w:numPr>
+        <w:shd w:val="clear" w:color="auto" w:fill="FFFFFF" w:themeFill="background1"/>
+        <w:bidi/>
+        <w:spacing w:after="0" w:line="240" w:lineRule="auto"/>
+        <w:rPr>
+          <w:rFonts w:cs="B Nazanin"/>
+          <w:b/>
+          <w:bCs/>
+          <w:color w:val="000000" w:themeColor="text1"/>
+          <w:sz w:val="28"/>
+          <w:szCs w:val="28"/>
+        </w:rPr>
+      </w:pPr>
+      <w:r>
+        <w:rPr>
+          <w:rFonts w:cs="B Nazanin"/>
+          <w:b/>
+          <w:bCs/>
+          <w:color w:val="000000" w:themeColor="text1"/>
+          <w:sz w:val="28"/>
+          <w:szCs w:val="28"/>
+          <w:rtl/>
+        </w:rPr>
+        <w:t>برای تست عملیات خواندن</w:t>
+      </w:r>
+      <w:r>
+        <w:rPr>
+          <w:rFonts w:cs="B Nazanin"/>
+          <w:b/>
+          <w:bCs/>
+          <w:color w:val="000000" w:themeColor="text1"/>
+          <w:sz w:val="28"/>
+          <w:szCs w:val="28"/>
+        </w:rPr>
+        <w:t xml:space="preserve"> (Read)</w:t>
+      </w:r>
+      <w:r>
+        <w:rPr>
+          <w:rFonts w:cs="B Nazanin"/>
+          <w:b/>
+          <w:bCs/>
+          <w:color w:val="000000" w:themeColor="text1"/>
+          <w:sz w:val="28"/>
+          <w:szCs w:val="28"/>
+          <w:rtl/>
+        </w:rPr>
+        <w:t>، از</w:t>
+      </w:r>
+      <w:r>
+        <w:rPr>
+          <w:rFonts w:cs="B Nazanin"/>
+          <w:b/>
+          <w:bCs/>
+          <w:color w:val="000000" w:themeColor="text1"/>
+          <w:sz w:val="28"/>
+          <w:szCs w:val="28"/>
+        </w:rPr>
+        <w:t xml:space="preserve"> Repository </w:t>
+      </w:r>
+      <w:r>
+        <w:rPr>
+          <w:rFonts w:cs="B Nazanin"/>
+          <w:b/>
+          <w:bCs/>
+          <w:color w:val="000000" w:themeColor="text1"/>
+          <w:sz w:val="28"/>
+          <w:szCs w:val="28"/>
+          <w:rtl/>
+        </w:rPr>
+        <w:t>واقعی به همراه دیتابیس</w:t>
+      </w:r>
+      <w:r>
+        <w:rPr>
+          <w:rFonts w:cs="B Nazanin"/>
+          <w:b/>
+          <w:bCs/>
+          <w:color w:val="000000" w:themeColor="text1"/>
+          <w:sz w:val="28"/>
+          <w:szCs w:val="28"/>
+        </w:rPr>
+        <w:t xml:space="preserve"> </w:t>
+      </w:r>
+      <w:proofErr w:type="spellStart"/>
+      <w:r>
+        <w:rPr>
+          <w:rFonts w:cs="B Nazanin"/>
+          <w:b/>
+          <w:bCs/>
+          <w:color w:val="000000" w:themeColor="text1"/>
+          <w:sz w:val="28"/>
+          <w:szCs w:val="28"/>
+        </w:rPr>
+        <w:t>InMemory</w:t>
+      </w:r>
+      <w:proofErr w:type="spellEnd"/>
+      <w:r>
+        <w:rPr>
+          <w:rFonts w:cs="B Nazanin"/>
+          <w:b/>
+          <w:bCs/>
+          <w:color w:val="000000" w:themeColor="text1"/>
+          <w:sz w:val="28"/>
+          <w:szCs w:val="28"/>
+        </w:rPr>
+        <w:t xml:space="preserve"> </w:t>
+      </w:r>
+      <w:r>
+        <w:rPr>
+          <w:rFonts w:cs="B Nazanin"/>
+          <w:b/>
+          <w:bCs/>
+          <w:color w:val="000000" w:themeColor="text1"/>
+          <w:sz w:val="28"/>
+          <w:szCs w:val="28"/>
+          <w:rtl/>
+        </w:rPr>
+        <w:t>استفاده شده است تا رفتار</w:t>
+      </w:r>
+      <w:r>
+        <w:rPr>
+          <w:rFonts w:cs="B Nazanin"/>
+          <w:b/>
+          <w:bCs/>
+          <w:color w:val="000000" w:themeColor="text1"/>
+          <w:sz w:val="28"/>
+          <w:szCs w:val="28"/>
+        </w:rPr>
+        <w:t xml:space="preserve"> Query</w:t>
+      </w:r>
+      <w:r>
+        <w:rPr>
+          <w:rFonts w:cs="B Nazanin"/>
+          <w:b/>
+          <w:bCs/>
+          <w:color w:val="000000" w:themeColor="text1"/>
+          <w:sz w:val="28"/>
+          <w:szCs w:val="28"/>
+          <w:rtl/>
+        </w:rPr>
+        <w:t xml:space="preserve">، </w:t>
+      </w:r>
+      <w:r>
+        <w:rPr>
+          <w:rFonts w:cs="B Nazanin"/>
+          <w:b/>
+          <w:bCs/>
+          <w:color w:val="000000" w:themeColor="text1"/>
+          <w:sz w:val="28"/>
+          <w:szCs w:val="28"/>
+        </w:rPr>
+        <w:t xml:space="preserve">Projection </w:t>
+      </w:r>
+      <w:r>
+        <w:rPr>
+          <w:rFonts w:cs="B Nazanin"/>
+          <w:b/>
+          <w:bCs/>
+          <w:color w:val="000000" w:themeColor="text1"/>
+          <w:sz w:val="28"/>
+          <w:szCs w:val="28"/>
+          <w:rtl/>
+        </w:rPr>
+        <w:t>و</w:t>
+      </w:r>
+      <w:r>
+        <w:rPr>
+          <w:rFonts w:cs="B Nazanin"/>
+          <w:b/>
+          <w:bCs/>
+          <w:color w:val="000000" w:themeColor="text1"/>
+          <w:sz w:val="28"/>
+          <w:szCs w:val="28"/>
+        </w:rPr>
+        <w:t xml:space="preserve"> Paging </w:t>
+      </w:r>
+      <w:r>
+        <w:rPr>
+          <w:rFonts w:cs="B Nazanin"/>
+          <w:b/>
+          <w:bCs/>
+          <w:color w:val="000000" w:themeColor="text1"/>
+          <w:sz w:val="28"/>
+          <w:szCs w:val="28"/>
+          <w:rtl/>
+        </w:rPr>
+        <w:t>نیز بررسی شود</w:t>
+      </w:r>
+      <w:r>
+        <w:rPr>
+          <w:rFonts w:cs="B Nazanin"/>
+          <w:b/>
+          <w:bCs/>
+          <w:color w:val="000000" w:themeColor="text1"/>
+          <w:sz w:val="28"/>
+          <w:szCs w:val="28"/>
+        </w:rPr>
+        <w:t>.</w:t>
+      </w:r>
+    </w:p>
+    <w:p>
+      <w:pPr>
+        <w:shd w:val="clear" w:color="auto" w:fill="FFFFFF" w:themeFill="background1"/>
+        <w:bidi/>
+        <w:spacing w:after="0" w:line="240" w:lineRule="auto"/>
+        <w:ind w:left="1440"/>
+        <w:rPr>
+          <w:rFonts w:cs="B Nazanin"/>
+          <w:b/>
+          <w:bCs/>
+          <w:color w:val="000000" w:themeColor="text1"/>
+          <w:sz w:val="28"/>
+          <w:szCs w:val="28"/>
+        </w:rPr>
+      </w:pPr>
+    </w:p>
+    <w:p>
+      <w:pPr>
+        <w:shd w:val="clear" w:color="auto" w:fill="FFFFFF" w:themeFill="background1"/>
+        <w:bidi/>
+        <w:spacing w:after="0" w:line="240" w:lineRule="auto"/>
+        <w:rPr>
+          <w:rFonts w:cs="B Nazanin"/>
+          <w:b/>
+          <w:bCs/>
+          <w:color w:val="000000" w:themeColor="text1"/>
+          <w:sz w:val="28"/>
+          <w:szCs w:val="28"/>
+          <w:rtl/>
+        </w:rPr>
+      </w:pPr>
+    </w:p>
+    <w:p>
+      <w:pPr>
+        <w:shd w:val="clear" w:color="auto" w:fill="FFFFFF" w:themeFill="background1"/>
+        <w:bidi/>
+        <w:spacing w:after="0" w:line="240" w:lineRule="auto"/>
+        <w:rPr>
+          <w:rFonts w:cs="B Nazanin"/>
+          <w:b/>
+          <w:bCs/>
+          <w:color w:val="000000" w:themeColor="text1"/>
+          <w:sz w:val="28"/>
+          <w:szCs w:val="28"/>
+        </w:rPr>
+      </w:pPr>
+      <w:r>
+        <w:rPr>
+          <w:rFonts w:cs="B Nazanin"/>
+          <w:b/>
+          <w:bCs/>
+          <w:color w:val="000000" w:themeColor="text1"/>
+          <w:sz w:val="28"/>
+          <w:szCs w:val="28"/>
+          <w:rtl/>
+        </w:rPr>
+        <w:lastRenderedPageBreak/>
         <w:t>جمع‌بندی</w:t>
       </w:r>
     </w:p>
@@ -15671,6 +16892,123 @@
     </w:lvl>
   </w:abstractNum>
   <w:abstractNum w:abstractNumId="10" w15:restartNumberingAfterBreak="0">
+    <w:nsid w:val="3FB122E8"/>
+    <w:multiLevelType w:val="multilevel"/>
+    <w:tmpl w:val="BAF6FBDA"/>
+    <w:lvl w:ilvl="0">
+      <w:start w:val="1"/>
+      <w:numFmt w:val="decimal"/>
+      <w:lvlText w:val="%1."/>
+      <w:lvlJc w:val="left"/>
+      <w:pPr>
+        <w:tabs>
+          <w:tab w:val="num" w:pos="720"/>
+        </w:tabs>
+        <w:ind w:left="720" w:hanging="360"/>
+      </w:pPr>
+    </w:lvl>
+    <w:lvl w:ilvl="1">
+      <w:start w:val="1"/>
+      <w:numFmt w:val="bullet"/>
+      <w:lvlText w:val="o"/>
+      <w:lvlJc w:val="left"/>
+      <w:pPr>
+        <w:tabs>
+          <w:tab w:val="num" w:pos="1440"/>
+        </w:tabs>
+        <w:ind w:left="1440" w:hanging="360"/>
+      </w:pPr>
+      <w:rPr>
+        <w:rFonts w:ascii="Courier New" w:hAnsi="Courier New" w:hint="default"/>
+        <w:sz w:val="20"/>
+      </w:rPr>
+    </w:lvl>
+    <w:lvl w:ilvl="2" w:tentative="1">
+      <w:start w:val="1"/>
+      <w:numFmt w:val="decimal"/>
+      <w:lvlText w:val="%3."/>
+      <w:lvlJc w:val="left"/>
+      <w:pPr>
+        <w:tabs>
+          <w:tab w:val="num" w:pos="2160"/>
+        </w:tabs>
+        <w:ind w:left="2160" w:hanging="360"/>
+      </w:pPr>
+    </w:lvl>
+    <w:lvl w:ilvl="3" w:tentative="1">
+      <w:start w:val="1"/>
+      <w:numFmt w:val="decimal"/>
+      <w:lvlText w:val="%4."/>
+      <w:lvlJc w:val="left"/>
+      <w:pPr>
+        <w:tabs>
+          <w:tab w:val="num" w:pos="2880"/>
+        </w:tabs>
+        <w:ind w:left="2880" w:hanging="360"/>
+      </w:pPr>
+    </w:lvl>
+    <w:lvl w:ilvl="4" w:tentative="1">
+      <w:start w:val="1"/>
+      <w:numFmt w:val="decimal"/>
+      <w:lvlText w:val="%5."/>
+      <w:lvlJc w:val="left"/>
+      <w:pPr>
+        <w:tabs>
+          <w:tab w:val="num" w:pos="3600"/>
+        </w:tabs>
+        <w:ind w:left="3600" w:hanging="360"/>
+      </w:pPr>
+    </w:lvl>
+    <w:lvl w:ilvl="5" w:tentative="1">
+      <w:start w:val="1"/>
+      <w:numFmt w:val="decimal"/>
+      <w:lvlText w:val="%6."/>
+      <w:lvlJc w:val="left"/>
+      <w:pPr>
+        <w:tabs>
+          <w:tab w:val="num" w:pos="4320"/>
+        </w:tabs>
+        <w:ind w:left="4320" w:hanging="360"/>
+      </w:pPr>
+    </w:lvl>
+    <w:lvl w:ilvl="6" w:tentative="1">
+      <w:start w:val="1"/>
+      <w:numFmt w:val="decimal"/>
+      <w:lvlText w:val="%7."/>
+      <w:lvlJc w:val="left"/>
+      <w:pPr>
+        <w:tabs>
+          <w:tab w:val="num" w:pos="5040"/>
+        </w:tabs>
+        <w:ind w:left="5040" w:hanging="360"/>
+      </w:pPr>
+    </w:lvl>
+    <w:lvl w:ilvl="7" w:tentative="1">
+      <w:start w:val="1"/>
+      <w:numFmt w:val="decimal"/>
+      <w:lvlText w:val="%8."/>
+      <w:lvlJc w:val="left"/>
+      <w:pPr>
+        <w:tabs>
+          <w:tab w:val="num" w:pos="5760"/>
+        </w:tabs>
+        <w:ind w:left="5760" w:hanging="360"/>
+      </w:pPr>
+    </w:lvl>
+    <w:lvl w:ilvl="8" w:tentative="1">
+      <w:start w:val="1"/>
+      <w:numFmt w:val="decimal"/>
+      <w:lvlText w:val="%9."/>
+      <w:lvlJc w:val="left"/>
+      <w:pPr>
+        <w:tabs>
+          <w:tab w:val="num" w:pos="6480"/>
+        </w:tabs>
+        <w:ind w:left="6480" w:hanging="360"/>
+      </w:pPr>
+    </w:lvl>
+  </w:abstractNum>
+  <w:abstractNum w:abstractNumId="11" w15:restartNumberingAfterBreak="0">
     <w:nsid w:val="44D84C42"/>
     <w:multiLevelType w:val="multilevel"/>
     <w:tmpl w:val="687A7FAE"/>
@@ -15819,7 +17157,7 @@
       </w:rPr>
     </w:lvl>
   </w:abstractNum>
-  <w:abstractNum w:abstractNumId="11" w15:restartNumberingAfterBreak="0">
+  <w:abstractNum w:abstractNumId="12" w15:restartNumberingAfterBreak="0">
     <w:nsid w:val="46B41E78"/>
     <w:multiLevelType w:val="multilevel"/>
     <w:tmpl w:val="48680C2C"/>
@@ -15968,7 +17306,7 @@
       </w:rPr>
     </w:lvl>
   </w:abstractNum>
-  <w:abstractNum w:abstractNumId="12" w15:restartNumberingAfterBreak="0">
+  <w:abstractNum w:abstractNumId="13" w15:restartNumberingAfterBreak="0">
     <w:nsid w:val="4A711A9C"/>
     <w:multiLevelType w:val="multilevel"/>
     <w:tmpl w:val="2F18F75C"/>
@@ -16117,7 +17455,7 @@
       </w:rPr>
     </w:lvl>
   </w:abstractNum>
-  <w:abstractNum w:abstractNumId="13" w15:restartNumberingAfterBreak="0">
+  <w:abstractNum w:abstractNumId="14" w15:restartNumberingAfterBreak="0">
     <w:nsid w:val="4A85207F"/>
     <w:multiLevelType w:val="multilevel"/>
     <w:tmpl w:val="B9F0A0DA"/>
@@ -16266,7 +17604,7 @@
       </w:rPr>
     </w:lvl>
   </w:abstractNum>
-  <w:abstractNum w:abstractNumId="14" w15:restartNumberingAfterBreak="0">
+  <w:abstractNum w:abstractNumId="15" w15:restartNumberingAfterBreak="0">
     <w:nsid w:val="4E3A41C9"/>
     <w:multiLevelType w:val="multilevel"/>
     <w:tmpl w:val="EC306A6C"/>
@@ -16415,7 +17753,7 @@
       </w:rPr>
     </w:lvl>
   </w:abstractNum>
-  <w:abstractNum w:abstractNumId="15" w15:restartNumberingAfterBreak="0">
+  <w:abstractNum w:abstractNumId="16" w15:restartNumberingAfterBreak="0">
     <w:nsid w:val="54CE23D3"/>
     <w:multiLevelType w:val="multilevel"/>
     <w:tmpl w:val="4014CB06"/>
@@ -16564,7 +17902,7 @@
       </w:rPr>
     </w:lvl>
   </w:abstractNum>
-  <w:abstractNum w:abstractNumId="16" w15:restartNumberingAfterBreak="0">
+  <w:abstractNum w:abstractNumId="17" w15:restartNumberingAfterBreak="0">
     <w:nsid w:val="5EAF18D0"/>
     <w:multiLevelType w:val="multilevel"/>
     <w:tmpl w:val="49049AD4"/>
@@ -16713,7 +18051,7 @@
       </w:rPr>
     </w:lvl>
   </w:abstractNum>
-  <w:abstractNum w:abstractNumId="17" w15:restartNumberingAfterBreak="0">
+  <w:abstractNum w:abstractNumId="18" w15:restartNumberingAfterBreak="0">
     <w:nsid w:val="5FDE03F1"/>
     <w:multiLevelType w:val="multilevel"/>
     <w:tmpl w:val="E050ED88"/>
@@ -16862,7 +18200,7 @@
       </w:rPr>
     </w:lvl>
   </w:abstractNum>
-  <w:abstractNum w:abstractNumId="18" w15:restartNumberingAfterBreak="0">
+  <w:abstractNum w:abstractNumId="19" w15:restartNumberingAfterBreak="0">
     <w:nsid w:val="61845F39"/>
     <w:multiLevelType w:val="multilevel"/>
     <w:tmpl w:val="C2C0C6F6"/>
@@ -17011,7 +18349,7 @@
       </w:rPr>
     </w:lvl>
   </w:abstractNum>
-  <w:abstractNum w:abstractNumId="19" w15:restartNumberingAfterBreak="0">
+  <w:abstractNum w:abstractNumId="20" w15:restartNumberingAfterBreak="0">
     <w:nsid w:val="668C68E2"/>
     <w:multiLevelType w:val="multilevel"/>
     <w:tmpl w:val="D56AEA4A"/>
@@ -17160,7 +18498,7 @@
       </w:rPr>
     </w:lvl>
   </w:abstractNum>
-  <w:abstractNum w:abstractNumId="20" w15:restartNumberingAfterBreak="0">
+  <w:abstractNum w:abstractNumId="21" w15:restartNumberingAfterBreak="0">
     <w:nsid w:val="698D032B"/>
     <w:multiLevelType w:val="multilevel"/>
     <w:tmpl w:val="59105106"/>
@@ -17309,7 +18647,7 @@
       </w:rPr>
     </w:lvl>
   </w:abstractNum>
-  <w:abstractNum w:abstractNumId="21" w15:restartNumberingAfterBreak="0">
+  <w:abstractNum w:abstractNumId="22" w15:restartNumberingAfterBreak="0">
     <w:nsid w:val="6E6721BE"/>
     <w:multiLevelType w:val="multilevel"/>
     <w:tmpl w:val="49A4974C"/>
@@ -17458,7 +18796,7 @@
       </w:rPr>
     </w:lvl>
   </w:abstractNum>
-  <w:abstractNum w:abstractNumId="22" w15:restartNumberingAfterBreak="0">
+  <w:abstractNum w:abstractNumId="23" w15:restartNumberingAfterBreak="0">
     <w:nsid w:val="74F353D3"/>
     <w:multiLevelType w:val="multilevel"/>
     <w:tmpl w:val="20EC62BC"/>
@@ -17607,7 +18945,7 @@
       </w:rPr>
     </w:lvl>
   </w:abstractNum>
-  <w:abstractNum w:abstractNumId="23" w15:restartNumberingAfterBreak="0">
+  <w:abstractNum w:abstractNumId="24" w15:restartNumberingAfterBreak="0">
     <w:nsid w:val="79477C3E"/>
     <w:multiLevelType w:val="multilevel"/>
     <w:tmpl w:val="76122D24"/>
@@ -17756,7 +19094,7 @@
       </w:rPr>
     </w:lvl>
   </w:abstractNum>
-  <w:abstractNum w:abstractNumId="24" w15:restartNumberingAfterBreak="0">
+  <w:abstractNum w:abstractNumId="25" w15:restartNumberingAfterBreak="0">
     <w:nsid w:val="7C0C3746"/>
     <w:multiLevelType w:val="multilevel"/>
     <w:tmpl w:val="7992489A"/>
@@ -17909,7 +19247,7 @@
     <w:abstractNumId w:val="8"/>
   </w:num>
   <w:num w:numId="2" w16cid:durableId="380979786">
-    <w:abstractNumId w:val="14"/>
+    <w:abstractNumId w:val="15"/>
   </w:num>
   <w:num w:numId="3" w16cid:durableId="1991325554">
     <w:abstractNumId w:val="5"/>
@@ -17918,25 +19256,25 @@
     <w:abstractNumId w:val="1"/>
   </w:num>
   <w:num w:numId="5" w16cid:durableId="1508597428">
-    <w:abstractNumId w:val="21"/>
+    <w:abstractNumId w:val="22"/>
   </w:num>
   <w:num w:numId="6" w16cid:durableId="1489638674">
-    <w:abstractNumId w:val="24"/>
+    <w:abstractNumId w:val="25"/>
   </w:num>
   <w:num w:numId="7" w16cid:durableId="872771496">
-    <w:abstractNumId w:val="18"/>
+    <w:abstractNumId w:val="19"/>
   </w:num>
   <w:num w:numId="8" w16cid:durableId="766731159">
     <w:abstractNumId w:val="0"/>
   </w:num>
   <w:num w:numId="9" w16cid:durableId="464010411">
-    <w:abstractNumId w:val="15"/>
+    <w:abstractNumId w:val="16"/>
   </w:num>
   <w:num w:numId="10" w16cid:durableId="376702429">
-    <w:abstractNumId w:val="23"/>
+    <w:abstractNumId w:val="24"/>
   </w:num>
   <w:num w:numId="11" w16cid:durableId="557133608">
-    <w:abstractNumId w:val="12"/>
+    <w:abstractNumId w:val="13"/>
   </w:num>
   <w:num w:numId="12" w16cid:durableId="1402748551">
     <w:abstractNumId w:val="9"/>
@@ -17948,37 +19286,40 @@
     <w:abstractNumId w:val="3"/>
   </w:num>
   <w:num w:numId="15" w16cid:durableId="1750032816">
-    <w:abstractNumId w:val="19"/>
+    <w:abstractNumId w:val="20"/>
   </w:num>
   <w:num w:numId="16" w16cid:durableId="1598319531">
     <w:abstractNumId w:val="2"/>
   </w:num>
   <w:num w:numId="17" w16cid:durableId="1020278582">
-    <w:abstractNumId w:val="11"/>
+    <w:abstractNumId w:val="12"/>
   </w:num>
   <w:num w:numId="18" w16cid:durableId="1806965205">
-    <w:abstractNumId w:val="20"/>
+    <w:abstractNumId w:val="21"/>
   </w:num>
   <w:num w:numId="19" w16cid:durableId="663044379">
-    <w:abstractNumId w:val="16"/>
+    <w:abstractNumId w:val="17"/>
   </w:num>
   <w:num w:numId="20" w16cid:durableId="903027288">
-    <w:abstractNumId w:val="13"/>
+    <w:abstractNumId w:val="14"/>
   </w:num>
   <w:num w:numId="21" w16cid:durableId="1210996816">
     <w:abstractNumId w:val="4"/>
   </w:num>
   <w:num w:numId="22" w16cid:durableId="799375236">
-    <w:abstractNumId w:val="22"/>
+    <w:abstractNumId w:val="23"/>
   </w:num>
   <w:num w:numId="23" w16cid:durableId="2130584195">
-    <w:abstractNumId w:val="17"/>
+    <w:abstractNumId w:val="18"/>
   </w:num>
   <w:num w:numId="24" w16cid:durableId="1552763995">
-    <w:abstractNumId w:val="10"/>
+    <w:abstractNumId w:val="11"/>
   </w:num>
   <w:num w:numId="25" w16cid:durableId="1417825648">
     <w:abstractNumId w:val="6"/>
+  </w:num>
+  <w:num w:numId="26" w16cid:durableId="979069182">
+    <w:abstractNumId w:val="10"/>
   </w:num>
 </w:numbering>
 </file>

</xml_diff>

<commit_message>
Fix Document - 3
</commit_message>
<xml_diff>
--- a/Document.docx
+++ b/Document.docx
@@ -14236,7 +14236,7 @@
           <w:szCs w:val="28"/>
           <w:rtl/>
         </w:rPr>
-        <w:t>وضعیت فعال بودن محصول</w:t>
+        <w:t>عدم وجود محصول</w:t>
       </w:r>
     </w:p>
     <w:p>
@@ -14267,18 +14267,7 @@
           <w:szCs w:val="28"/>
           <w:rtl/>
         </w:rPr>
-        <w:t>هر محصول دارای وضعیت فعال/غیرفعال</w:t>
-      </w:r>
-      <w:r>
-        <w:rPr>
-          <w:rFonts w:cs="B Nazanin"/>
-          <w:b/>
-          <w:bCs/>
-          <w:color w:val="000000" w:themeColor="text1"/>
-          <w:sz w:val="28"/>
-          <w:szCs w:val="28"/>
-        </w:rPr>
-        <w:t xml:space="preserve"> (</w:t>
+        <w:t xml:space="preserve">در صورتی که محصولی با شناسه درخواستی وجود نداشته باشد، سرویس با پرتاب </w:t>
       </w:r>
       <w:proofErr w:type="spellStart"/>
       <w:r>
@@ -14290,7 +14279,7 @@
           <w:sz w:val="28"/>
           <w:szCs w:val="28"/>
         </w:rPr>
-        <w:t>IsActive</w:t>
+        <w:t>NotFoundException</w:t>
       </w:r>
       <w:proofErr w:type="spellEnd"/>
       <w:r>
@@ -14302,19 +14291,19 @@
           <w:sz w:val="28"/>
           <w:szCs w:val="28"/>
         </w:rPr>
-        <w:t xml:space="preserve">) </w:t>
-      </w:r>
-      <w:r>
-        <w:rPr>
-          <w:rFonts w:cs="B Nazanin"/>
-          <w:b/>
-          <w:bCs/>
-          <w:color w:val="000000" w:themeColor="text1"/>
-          <w:sz w:val="28"/>
-          <w:szCs w:val="28"/>
-          <w:rtl/>
-        </w:rPr>
-        <w:t>است و این وضعیت در عملیات  ویرایش قابل مدیریت است</w:t>
+        <w:t xml:space="preserve"> </w:t>
+      </w:r>
+      <w:r>
+        <w:rPr>
+          <w:rFonts w:cs="B Nazanin"/>
+          <w:b/>
+          <w:bCs/>
+          <w:color w:val="000000" w:themeColor="text1"/>
+          <w:sz w:val="28"/>
+          <w:szCs w:val="28"/>
+          <w:rtl/>
+        </w:rPr>
+        <w:t>به این وضعیت پاسخ می‌دهد</w:t>
       </w:r>
       <w:r>
         <w:rPr>
@@ -14356,7 +14345,7 @@
           <w:szCs w:val="28"/>
           <w:rtl/>
         </w:rPr>
-        <w:t>عدم وجود محصول</w:t>
+        <w:t>واحد اندازه‌گیری</w:t>
       </w:r>
     </w:p>
     <w:p>
@@ -14387,7 +14376,18 @@
           <w:szCs w:val="28"/>
           <w:rtl/>
         </w:rPr>
-        <w:t xml:space="preserve">در صورتی که محصولی با شناسه درخواستی وجود نداشته باشد، سرویس با پرتاب </w:t>
+        <w:t>واحد اندازه‌گیری محصولات از مقادیر تعریف‌شده در</w:t>
+      </w:r>
+      <w:r>
+        <w:rPr>
+          <w:rFonts w:cs="B Nazanin"/>
+          <w:b/>
+          <w:bCs/>
+          <w:color w:val="000000" w:themeColor="text1"/>
+          <w:sz w:val="28"/>
+          <w:szCs w:val="28"/>
+        </w:rPr>
+        <w:t xml:space="preserve"> Enum </w:t>
       </w:r>
       <w:proofErr w:type="spellStart"/>
       <w:r>
@@ -14399,7 +14399,7 @@
           <w:sz w:val="28"/>
           <w:szCs w:val="28"/>
         </w:rPr>
-        <w:t>NotFoundException</w:t>
+        <w:t>UnitOfMeasure</w:t>
       </w:r>
       <w:proofErr w:type="spellEnd"/>
       <w:r>
@@ -14423,7 +14423,7 @@
           <w:szCs w:val="28"/>
           <w:rtl/>
         </w:rPr>
-        <w:t>به این وضعیت پاسخ می‌دهد</w:t>
+        <w:t>انتخاب می‌شود و مقدار نامعتبر قابل قبول نیست</w:t>
       </w:r>
       <w:r>
         <w:rPr>
@@ -14465,7 +14465,7 @@
           <w:szCs w:val="28"/>
           <w:rtl/>
         </w:rPr>
-        <w:t>واحد اندازه‌گیری</w:t>
+        <w:t>تست‌ها</w:t>
       </w:r>
     </w:p>
     <w:p>
@@ -14496,54 +14496,99 @@
           <w:szCs w:val="28"/>
           <w:rtl/>
         </w:rPr>
-        <w:t>واحد اندازه‌گیری محصولات از مقادیر تعریف‌شده در</w:t>
-      </w:r>
-      <w:r>
-        <w:rPr>
-          <w:rFonts w:cs="B Nazanin"/>
-          <w:b/>
-          <w:bCs/>
-          <w:color w:val="000000" w:themeColor="text1"/>
-          <w:sz w:val="28"/>
-          <w:szCs w:val="28"/>
-        </w:rPr>
-        <w:t xml:space="preserve"> Enum </w:t>
-      </w:r>
-      <w:proofErr w:type="spellStart"/>
-      <w:r>
-        <w:rPr>
-          <w:rFonts w:cs="B Nazanin"/>
-          <w:b/>
-          <w:bCs/>
-          <w:color w:val="000000" w:themeColor="text1"/>
-          <w:sz w:val="28"/>
-          <w:szCs w:val="28"/>
-        </w:rPr>
-        <w:t>UnitOfMeasure</w:t>
-      </w:r>
-      <w:proofErr w:type="spellEnd"/>
-      <w:r>
-        <w:rPr>
-          <w:rFonts w:cs="B Nazanin"/>
-          <w:b/>
-          <w:bCs/>
-          <w:color w:val="000000" w:themeColor="text1"/>
-          <w:sz w:val="28"/>
-          <w:szCs w:val="28"/>
-        </w:rPr>
-        <w:t xml:space="preserve"> </w:t>
-      </w:r>
-      <w:r>
-        <w:rPr>
-          <w:rFonts w:cs="B Nazanin"/>
-          <w:b/>
-          <w:bCs/>
-          <w:color w:val="000000" w:themeColor="text1"/>
-          <w:sz w:val="28"/>
-          <w:szCs w:val="28"/>
-          <w:rtl/>
-        </w:rPr>
-        <w:t>انتخاب می‌شود و مقدار نامعتبر قابل قبول نیست</w:t>
+        <w:t>برای تست عملیات</w:t>
+      </w:r>
+      <w:r>
+        <w:rPr>
+          <w:rFonts w:cs="B Nazanin"/>
+          <w:b/>
+          <w:bCs/>
+          <w:color w:val="000000" w:themeColor="text1"/>
+          <w:sz w:val="28"/>
+          <w:szCs w:val="28"/>
+        </w:rPr>
+        <w:t xml:space="preserve"> Create</w:t>
+      </w:r>
+      <w:r>
+        <w:rPr>
+          <w:rFonts w:cs="B Nazanin"/>
+          <w:b/>
+          <w:bCs/>
+          <w:color w:val="000000" w:themeColor="text1"/>
+          <w:sz w:val="28"/>
+          <w:szCs w:val="28"/>
+          <w:rtl/>
+        </w:rPr>
+        <w:t xml:space="preserve">، </w:t>
+      </w:r>
+      <w:r>
+        <w:rPr>
+          <w:rFonts w:cs="B Nazanin"/>
+          <w:b/>
+          <w:bCs/>
+          <w:color w:val="000000" w:themeColor="text1"/>
+          <w:sz w:val="28"/>
+          <w:szCs w:val="28"/>
+        </w:rPr>
+        <w:t xml:space="preserve">Update </w:t>
+      </w:r>
+      <w:r>
+        <w:rPr>
+          <w:rFonts w:cs="B Nazanin"/>
+          <w:b/>
+          <w:bCs/>
+          <w:color w:val="000000" w:themeColor="text1"/>
+          <w:sz w:val="28"/>
+          <w:szCs w:val="28"/>
+          <w:rtl/>
+        </w:rPr>
+        <w:t>و</w:t>
+      </w:r>
+      <w:r>
+        <w:rPr>
+          <w:rFonts w:cs="B Nazanin"/>
+          <w:b/>
+          <w:bCs/>
+          <w:color w:val="000000" w:themeColor="text1"/>
+          <w:sz w:val="28"/>
+          <w:szCs w:val="28"/>
+        </w:rPr>
+        <w:t xml:space="preserve"> Delete </w:t>
+      </w:r>
+      <w:r>
+        <w:rPr>
+          <w:rFonts w:cs="B Nazanin"/>
+          <w:b/>
+          <w:bCs/>
+          <w:color w:val="000000" w:themeColor="text1"/>
+          <w:sz w:val="28"/>
+          <w:szCs w:val="28"/>
+          <w:rtl/>
+        </w:rPr>
+        <w:t>از</w:t>
+      </w:r>
+      <w:r>
+        <w:rPr>
+          <w:rFonts w:cs="B Nazanin"/>
+          <w:b/>
+          <w:bCs/>
+          <w:color w:val="000000" w:themeColor="text1"/>
+          <w:sz w:val="28"/>
+          <w:szCs w:val="28"/>
+        </w:rPr>
+        <w:t xml:space="preserve"> Mock Repository </w:t>
+      </w:r>
+      <w:r>
+        <w:rPr>
+          <w:rFonts w:cs="B Nazanin"/>
+          <w:b/>
+          <w:bCs/>
+          <w:color w:val="000000" w:themeColor="text1"/>
+          <w:sz w:val="28"/>
+          <w:szCs w:val="28"/>
+          <w:rtl/>
+        </w:rPr>
+        <w:t>استفاده شده است تا منطق سرویس به‌صورت مستقل بررسی شود</w:t>
       </w:r>
       <w:r>
         <w:rPr>
@@ -14555,37 +14600,6 @@
           <w:szCs w:val="28"/>
         </w:rPr>
         <w:t>.</w:t>
-      </w:r>
-    </w:p>
-    <w:p>
-      <w:pPr>
-        <w:numPr>
-          <w:ilvl w:val="0"/>
-          <w:numId w:val="26"/>
-        </w:numPr>
-        <w:shd w:val="clear" w:color="auto" w:fill="FFFFFF" w:themeFill="background1"/>
-        <w:bidi/>
-        <w:spacing w:after="0" w:line="240" w:lineRule="auto"/>
-        <w:rPr>
-          <w:rFonts w:cs="B Nazanin"/>
-          <w:b/>
-          <w:bCs/>
-          <w:color w:val="000000" w:themeColor="text1"/>
-          <w:sz w:val="28"/>
-          <w:szCs w:val="28"/>
-        </w:rPr>
-      </w:pPr>
-      <w:r>
-        <w:rPr>
-          <w:rFonts w:cs="B Nazanin"/>
-          <w:b/>
-          <w:bCs/>
-          <w:color w:val="000000" w:themeColor="text1"/>
-          <w:sz w:val="28"/>
-          <w:szCs w:val="28"/>
-          <w:rtl/>
-        </w:rPr>
-        <w:t>تست‌ها</w:t>
       </w:r>
     </w:p>
     <w:p>
@@ -14616,18 +14630,111 @@
           <w:szCs w:val="28"/>
           <w:rtl/>
         </w:rPr>
-        <w:t>برای تست عملیات</w:t>
-      </w:r>
-      <w:r>
-        <w:rPr>
-          <w:rFonts w:cs="B Nazanin"/>
-          <w:b/>
-          <w:bCs/>
-          <w:color w:val="000000" w:themeColor="text1"/>
-          <w:sz w:val="28"/>
-          <w:szCs w:val="28"/>
-        </w:rPr>
-        <w:t xml:space="preserve"> Create</w:t>
+        <w:t>برای تست عملیات خواندن</w:t>
+      </w:r>
+      <w:r>
+        <w:rPr>
+          <w:rFonts w:cs="B Nazanin"/>
+          <w:b/>
+          <w:bCs/>
+          <w:color w:val="000000" w:themeColor="text1"/>
+          <w:sz w:val="28"/>
+          <w:szCs w:val="28"/>
+        </w:rPr>
+        <w:t xml:space="preserve"> (Read)</w:t>
+      </w:r>
+      <w:r>
+        <w:rPr>
+          <w:rFonts w:cs="B Nazanin"/>
+          <w:b/>
+          <w:bCs/>
+          <w:color w:val="000000" w:themeColor="text1"/>
+          <w:sz w:val="28"/>
+          <w:szCs w:val="28"/>
+          <w:rtl/>
+        </w:rPr>
+        <w:t>، از</w:t>
+      </w:r>
+      <w:r>
+        <w:rPr>
+          <w:rFonts w:cs="B Nazanin"/>
+          <w:b/>
+          <w:bCs/>
+          <w:color w:val="000000" w:themeColor="text1"/>
+          <w:sz w:val="28"/>
+          <w:szCs w:val="28"/>
+        </w:rPr>
+        <w:t xml:space="preserve"> Repository </w:t>
+      </w:r>
+      <w:r>
+        <w:rPr>
+          <w:rFonts w:cs="B Nazanin"/>
+          <w:b/>
+          <w:bCs/>
+          <w:color w:val="000000" w:themeColor="text1"/>
+          <w:sz w:val="28"/>
+          <w:szCs w:val="28"/>
+          <w:rtl/>
+        </w:rPr>
+        <w:t>واقعی به همراه دیتابیس</w:t>
+      </w:r>
+      <w:r>
+        <w:rPr>
+          <w:rFonts w:cs="B Nazanin"/>
+          <w:b/>
+          <w:bCs/>
+          <w:color w:val="000000" w:themeColor="text1"/>
+          <w:sz w:val="28"/>
+          <w:szCs w:val="28"/>
+        </w:rPr>
+        <w:t xml:space="preserve"> </w:t>
+      </w:r>
+      <w:proofErr w:type="spellStart"/>
+      <w:r>
+        <w:rPr>
+          <w:rFonts w:cs="B Nazanin"/>
+          <w:b/>
+          <w:bCs/>
+          <w:color w:val="000000" w:themeColor="text1"/>
+          <w:sz w:val="28"/>
+          <w:szCs w:val="28"/>
+        </w:rPr>
+        <w:t>InMemory</w:t>
+      </w:r>
+      <w:proofErr w:type="spellEnd"/>
+      <w:r>
+        <w:rPr>
+          <w:rFonts w:cs="B Nazanin"/>
+          <w:b/>
+          <w:bCs/>
+          <w:color w:val="000000" w:themeColor="text1"/>
+          <w:sz w:val="28"/>
+          <w:szCs w:val="28"/>
+        </w:rPr>
+        <w:t xml:space="preserve"> </w:t>
+      </w:r>
+      <w:r>
+        <w:rPr>
+          <w:rFonts w:cs="B Nazanin"/>
+          <w:b/>
+          <w:bCs/>
+          <w:color w:val="000000" w:themeColor="text1"/>
+          <w:sz w:val="28"/>
+          <w:szCs w:val="28"/>
+          <w:rtl/>
+        </w:rPr>
+        <w:t>استفاده شده است تا رفتار</w:t>
+      </w:r>
+      <w:r>
+        <w:rPr>
+          <w:rFonts w:cs="B Nazanin"/>
+          <w:b/>
+          <w:bCs/>
+          <w:color w:val="000000" w:themeColor="text1"/>
+          <w:sz w:val="28"/>
+          <w:szCs w:val="28"/>
+        </w:rPr>
+        <w:t xml:space="preserve"> Query</w:t>
       </w:r>
       <w:r>
         <w:rPr>
@@ -14650,7 +14757,7 @@
           <w:sz w:val="28"/>
           <w:szCs w:val="28"/>
         </w:rPr>
-        <w:t xml:space="preserve">Update </w:t>
+        <w:t xml:space="preserve">Projection </w:t>
       </w:r>
       <w:r>
         <w:rPr>
@@ -14673,42 +14780,19 @@
           <w:sz w:val="28"/>
           <w:szCs w:val="28"/>
         </w:rPr>
-        <w:t xml:space="preserve"> Delete </w:t>
-      </w:r>
-      <w:r>
-        <w:rPr>
-          <w:rFonts w:cs="B Nazanin"/>
-          <w:b/>
-          <w:bCs/>
-          <w:color w:val="000000" w:themeColor="text1"/>
-          <w:sz w:val="28"/>
-          <w:szCs w:val="28"/>
-          <w:rtl/>
-        </w:rPr>
-        <w:t>از</w:t>
-      </w:r>
-      <w:r>
-        <w:rPr>
-          <w:rFonts w:cs="B Nazanin"/>
-          <w:b/>
-          <w:bCs/>
-          <w:color w:val="000000" w:themeColor="text1"/>
-          <w:sz w:val="28"/>
-          <w:szCs w:val="28"/>
-        </w:rPr>
-        <w:t xml:space="preserve"> Mock Repository </w:t>
-      </w:r>
-      <w:r>
-        <w:rPr>
-          <w:rFonts w:cs="B Nazanin"/>
-          <w:b/>
-          <w:bCs/>
-          <w:color w:val="000000" w:themeColor="text1"/>
-          <w:sz w:val="28"/>
-          <w:szCs w:val="28"/>
-          <w:rtl/>
-        </w:rPr>
-        <w:t>استفاده شده است تا منطق سرویس به‌صورت مستقل بررسی شود</w:t>
+        <w:t xml:space="preserve"> Paging </w:t>
+      </w:r>
+      <w:r>
+        <w:rPr>
+          <w:rFonts w:cs="B Nazanin"/>
+          <w:b/>
+          <w:bCs/>
+          <w:color w:val="000000" w:themeColor="text1"/>
+          <w:sz w:val="28"/>
+          <w:szCs w:val="28"/>
+          <w:rtl/>
+        </w:rPr>
+        <w:t>نیز بررسی شود</w:t>
       </w:r>
       <w:r>
         <w:rPr>
@@ -14724,214 +14808,70 @@
     </w:p>
     <w:p>
       <w:pPr>
-        <w:numPr>
-          <w:ilvl w:val="1"/>
-          <w:numId w:val="26"/>
-        </w:numPr>
-        <w:shd w:val="clear" w:color="auto" w:fill="FFFFFF" w:themeFill="background1"/>
-        <w:bidi/>
-        <w:spacing w:after="0" w:line="240" w:lineRule="auto"/>
-        <w:rPr>
-          <w:rFonts w:cs="B Nazanin"/>
-          <w:b/>
-          <w:bCs/>
-          <w:color w:val="000000" w:themeColor="text1"/>
-          <w:sz w:val="28"/>
-          <w:szCs w:val="28"/>
-        </w:rPr>
-      </w:pPr>
-      <w:r>
-        <w:rPr>
-          <w:rFonts w:cs="B Nazanin"/>
-          <w:b/>
-          <w:bCs/>
-          <w:color w:val="000000" w:themeColor="text1"/>
-          <w:sz w:val="28"/>
-          <w:szCs w:val="28"/>
-          <w:rtl/>
-        </w:rPr>
-        <w:t>برای تست عملیات خواندن</w:t>
-      </w:r>
-      <w:r>
-        <w:rPr>
-          <w:rFonts w:cs="B Nazanin"/>
-          <w:b/>
-          <w:bCs/>
-          <w:color w:val="000000" w:themeColor="text1"/>
-          <w:sz w:val="28"/>
-          <w:szCs w:val="28"/>
-        </w:rPr>
-        <w:t xml:space="preserve"> (Read)</w:t>
-      </w:r>
-      <w:r>
-        <w:rPr>
-          <w:rFonts w:cs="B Nazanin"/>
-          <w:b/>
-          <w:bCs/>
-          <w:color w:val="000000" w:themeColor="text1"/>
-          <w:sz w:val="28"/>
-          <w:szCs w:val="28"/>
-          <w:rtl/>
-        </w:rPr>
-        <w:t>، از</w:t>
-      </w:r>
-      <w:r>
-        <w:rPr>
-          <w:rFonts w:cs="B Nazanin"/>
-          <w:b/>
-          <w:bCs/>
-          <w:color w:val="000000" w:themeColor="text1"/>
-          <w:sz w:val="28"/>
-          <w:szCs w:val="28"/>
-        </w:rPr>
-        <w:t xml:space="preserve"> Repository </w:t>
-      </w:r>
-      <w:r>
-        <w:rPr>
-          <w:rFonts w:cs="B Nazanin"/>
-          <w:b/>
-          <w:bCs/>
-          <w:color w:val="000000" w:themeColor="text1"/>
-          <w:sz w:val="28"/>
-          <w:szCs w:val="28"/>
-          <w:rtl/>
-        </w:rPr>
-        <w:t>واقعی به همراه دیتابیس</w:t>
-      </w:r>
-      <w:r>
-        <w:rPr>
-          <w:rFonts w:cs="B Nazanin"/>
-          <w:b/>
-          <w:bCs/>
-          <w:color w:val="000000" w:themeColor="text1"/>
-          <w:sz w:val="28"/>
-          <w:szCs w:val="28"/>
-        </w:rPr>
-        <w:t xml:space="preserve"> </w:t>
-      </w:r>
-      <w:proofErr w:type="spellStart"/>
-      <w:r>
-        <w:rPr>
-          <w:rFonts w:cs="B Nazanin"/>
-          <w:b/>
-          <w:bCs/>
-          <w:color w:val="000000" w:themeColor="text1"/>
-          <w:sz w:val="28"/>
-          <w:szCs w:val="28"/>
-        </w:rPr>
-        <w:t>InMemory</w:t>
-      </w:r>
-      <w:proofErr w:type="spellEnd"/>
-      <w:r>
-        <w:rPr>
-          <w:rFonts w:cs="B Nazanin"/>
-          <w:b/>
-          <w:bCs/>
-          <w:color w:val="000000" w:themeColor="text1"/>
-          <w:sz w:val="28"/>
-          <w:szCs w:val="28"/>
-        </w:rPr>
-        <w:t xml:space="preserve"> </w:t>
-      </w:r>
-      <w:r>
-        <w:rPr>
-          <w:rFonts w:cs="B Nazanin"/>
-          <w:b/>
-          <w:bCs/>
-          <w:color w:val="000000" w:themeColor="text1"/>
-          <w:sz w:val="28"/>
-          <w:szCs w:val="28"/>
-          <w:rtl/>
-        </w:rPr>
-        <w:t>استفاده شده است تا رفتار</w:t>
-      </w:r>
-      <w:r>
-        <w:rPr>
-          <w:rFonts w:cs="B Nazanin"/>
-          <w:b/>
-          <w:bCs/>
-          <w:color w:val="000000" w:themeColor="text1"/>
-          <w:sz w:val="28"/>
-          <w:szCs w:val="28"/>
-        </w:rPr>
-        <w:t xml:space="preserve"> Query</w:t>
-      </w:r>
-      <w:r>
-        <w:rPr>
-          <w:rFonts w:cs="B Nazanin"/>
-          <w:b/>
-          <w:bCs/>
-          <w:color w:val="000000" w:themeColor="text1"/>
-          <w:sz w:val="28"/>
-          <w:szCs w:val="28"/>
-          <w:rtl/>
-        </w:rPr>
-        <w:t xml:space="preserve">، </w:t>
-      </w:r>
-      <w:r>
-        <w:rPr>
-          <w:rFonts w:cs="B Nazanin"/>
-          <w:b/>
-          <w:bCs/>
-          <w:color w:val="000000" w:themeColor="text1"/>
-          <w:sz w:val="28"/>
-          <w:szCs w:val="28"/>
-        </w:rPr>
-        <w:t xml:space="preserve">Projection </w:t>
-      </w:r>
-      <w:r>
-        <w:rPr>
-          <w:rFonts w:cs="B Nazanin"/>
-          <w:b/>
-          <w:bCs/>
-          <w:color w:val="000000" w:themeColor="text1"/>
-          <w:sz w:val="28"/>
-          <w:szCs w:val="28"/>
-          <w:rtl/>
-        </w:rPr>
-        <w:t>و</w:t>
-      </w:r>
-      <w:r>
-        <w:rPr>
-          <w:rFonts w:cs="B Nazanin"/>
-          <w:b/>
-          <w:bCs/>
-          <w:color w:val="000000" w:themeColor="text1"/>
-          <w:sz w:val="28"/>
-          <w:szCs w:val="28"/>
-        </w:rPr>
-        <w:t xml:space="preserve"> Paging </w:t>
-      </w:r>
-      <w:r>
-        <w:rPr>
-          <w:rFonts w:cs="B Nazanin"/>
-          <w:b/>
-          <w:bCs/>
-          <w:color w:val="000000" w:themeColor="text1"/>
-          <w:sz w:val="28"/>
-          <w:szCs w:val="28"/>
-          <w:rtl/>
-        </w:rPr>
-        <w:t>نیز بررسی شود</w:t>
-      </w:r>
-      <w:r>
-        <w:rPr>
-          <w:rFonts w:cs="B Nazanin"/>
-          <w:b/>
-          <w:bCs/>
-          <w:color w:val="000000" w:themeColor="text1"/>
-          <w:sz w:val="28"/>
-          <w:szCs w:val="28"/>
-        </w:rPr>
-        <w:t>.</w:t>
-      </w:r>
-    </w:p>
-    <w:p>
-      <w:pPr>
         <w:shd w:val="clear" w:color="auto" w:fill="FFFFFF" w:themeFill="background1"/>
         <w:bidi/>
         <w:spacing w:after="0" w:line="240" w:lineRule="auto"/>
         <w:ind w:left="1440"/>
+        <w:rPr>
+          <w:rFonts w:cs="B Nazanin"/>
+          <w:b/>
+          <w:bCs/>
+          <w:color w:val="000000" w:themeColor="text1"/>
+          <w:sz w:val="28"/>
+          <w:szCs w:val="28"/>
+        </w:rPr>
+      </w:pPr>
+    </w:p>
+    <w:p>
+      <w:pPr>
+        <w:shd w:val="clear" w:color="auto" w:fill="FFFFFF" w:themeFill="background1"/>
+        <w:bidi/>
+        <w:spacing w:after="0" w:line="240" w:lineRule="auto"/>
+        <w:rPr>
+          <w:rFonts w:cs="B Nazanin"/>
+          <w:b/>
+          <w:bCs/>
+          <w:color w:val="000000" w:themeColor="text1"/>
+          <w:sz w:val="28"/>
+          <w:szCs w:val="28"/>
+        </w:rPr>
+      </w:pPr>
+    </w:p>
+    <w:p>
+      <w:pPr>
+        <w:shd w:val="clear" w:color="auto" w:fill="FFFFFF" w:themeFill="background1"/>
+        <w:bidi/>
+        <w:spacing w:after="0" w:line="240" w:lineRule="auto"/>
+        <w:rPr>
+          <w:rFonts w:cs="B Nazanin"/>
+          <w:b/>
+          <w:bCs/>
+          <w:color w:val="000000" w:themeColor="text1"/>
+          <w:sz w:val="28"/>
+          <w:szCs w:val="28"/>
+        </w:rPr>
+      </w:pPr>
+    </w:p>
+    <w:p>
+      <w:pPr>
+        <w:shd w:val="clear" w:color="auto" w:fill="FFFFFF" w:themeFill="background1"/>
+        <w:bidi/>
+        <w:spacing w:after="0" w:line="240" w:lineRule="auto"/>
+        <w:rPr>
+          <w:rFonts w:cs="B Nazanin"/>
+          <w:b/>
+          <w:bCs/>
+          <w:color w:val="000000" w:themeColor="text1"/>
+          <w:sz w:val="28"/>
+          <w:szCs w:val="28"/>
+        </w:rPr>
+      </w:pPr>
+    </w:p>
+    <w:p>
+      <w:pPr>
+        <w:shd w:val="clear" w:color="auto" w:fill="FFFFFF" w:themeFill="background1"/>
+        <w:bidi/>
+        <w:spacing w:after="0" w:line="240" w:lineRule="auto"/>
         <w:rPr>
           <w:rFonts w:cs="B Nazanin"/>
           <w:b/>
@@ -19928,6 +19868,7 @@
   <w:style w:type="character" w:default="1" w:styleId="DefaultParagraphFont">
     <w:name w:val="Default Paragraph Font"/>
     <w:uiPriority w:val="1"/>
+    <w:semiHidden/>
     <w:unhideWhenUsed/>
   </w:style>
   <w:style w:type="table" w:default="1" w:styleId="TableNormal">

</xml_diff>